<commit_message>
feat: Integrate POC renderer features into detailed_findings module
- Enhanced report_modular.py with donut chart generation and colored borders
- Added imports: InlineImage, Cm, _generate_donut_image, _set_table_left_border, RISK_COLORS
- Updated render_module() with module_name parameter for special handling
- detailed_findings module now generates donut charts for each finding
- Applied colored left borders to tables based on risk level (Critical=red, High=orange, etc.)
- Updated detailed_findings.docx template with donut_img placeholder
- Regenerated all 11 module templates with latest code
- Added test_donut_integration.py test script - all tests passing ✅
- Test confirms: 2 inline shapes (donut charts), 2 tables with colored borders

Integration complete - detailed_findings now has advanced POC visualizations
</commit_message>
<xml_diff>
--- a/backend/app/report_modules/detailed_findings.docx
+++ b/backend/app/report_modules/detailed_findings.docx
@@ -22,6 +22,11 @@
       </w:pPr>
       <w:r>
         <w:t>{{ f.section_number }} {{ f.title }} ({{ f.risk_rating }})</w:t>
+      </w:r>
+    </w:p>
+    <w:p>
+      <w:r>
+        <w:t>{{ f.donut_img }}</w:t>
       </w:r>
     </w:p>
     <w:tbl>

</xml_diff>